<commit_message>
docs: kurulum kılavuzu otomatik güncellendi (installer değişikliği)
</commit_message>
<xml_diff>
--- a/docs/Envisoft-WebX-Kurulum-Kilavuzu.docx
+++ b/docs/Envisoft-WebX-Kurulum-Kilavuzu.docx
@@ -1820,7 +1820,7 @@
         <w:rPr>
           <w:b/>
         </w:rPr>
-        <w:t>lisans</w:t>
+        <w:t>lisans modu</w:t>
       </w:r>
       <w:r>
         <w:rPr>
@@ -1863,6 +1863,52 @@
           <w:b w:val="0"/>
         </w:rPr>
         <w:t>.</w:t>
+      </w:r>
+    </w:p>
+    <w:p>
+      <w:pPr>
+        <w:pStyle w:val="ListBullet"/>
+      </w:pPr>
+      <w:r>
+        <w:rPr>
+          <w:b w:val="0"/>
+        </w:rPr>
+      </w:r>
+      <w:r>
+        <w:rPr>
+          <w:b/>
+        </w:rPr>
+        <w:t>Lisans modu:</w:t>
+      </w:r>
+      <w:r>
+        <w:rPr>
+          <w:b w:val="0"/>
+        </w:rPr>
+        <w:t xml:space="preserve"> </w:t>
+      </w:r>
+      <w:r>
+        <w:rPr>
+          <w:b/>
+        </w:rPr>
+        <w:t>Deneme</w:t>
+      </w:r>
+      <w:r>
+        <w:rPr>
+          <w:b w:val="0"/>
+        </w:rPr>
+        <w:t xml:space="preserve"> (30 gün, sonunda kilitlenir) veya </w:t>
+      </w:r>
+      <w:r>
+        <w:rPr>
+          <w:b/>
+        </w:rPr>
+        <w:t>Lisanslı</w:t>
+      </w:r>
+      <w:r>
+        <w:rPr>
+          <w:b w:val="0"/>
+        </w:rPr>
+        <w:t xml:space="preserve"> (anahtar + URL girin). Lisans zorlaması güvenlik gereği yapılandırmadan kapatılamaz.</w:t>
       </w:r>
     </w:p>
     <w:p>
@@ -2243,13 +2289,13 @@
         <w:rPr>
           <w:b/>
         </w:rPr>
-        <w:t>Lisans anahtarı / URL</w:t>
+        <w:t>Lisans modu:</w:t>
       </w:r>
       <w:r>
         <w:rPr>
           <w:b w:val="0"/>
         </w:rPr>
-        <w:t xml:space="preserve"> (yoksa boş geçin)</w:t>
+        <w:t xml:space="preserve"> [1] Lisanslı (anahtar + URL) veya [2] Deneme (30 gün, sonunda kilitlenir). Varsayılan Deneme.</w:t>
       </w:r>
     </w:p>
     <w:p>

</xml_diff>